<commit_message>
Ajuste geral de proposta SETCEmg com criaçaoi de cids
</commit_message>
<xml_diff>
--- a/plennuscApp/public/uploadgestao/docs/youBut/PROPOSTA_SETCEMG_UNITARIO.docx
+++ b/plennuscApp/public/uploadgestao/docs/youBut/PROPOSTA_SETCEMG_UNITARIO.docx
@@ -1,6 +1,6 @@
 
 <file path=word/document.xml><?xml version="1.0" encoding="utf-8"?>
-<w:document xmlns:wpc="http://schemas.microsoft.com/office/word/2010/wordprocessingCanvas" xmlns:cx="http://schemas.microsoft.com/office/drawing/2014/chartex" xmlns:cx1="http://schemas.microsoft.com/office/drawing/2015/9/8/chartex" xmlns:cx2="http://schemas.microsoft.com/office/drawing/2015/10/21/chartex" xmlns:cx3="http://schemas.microsoft.com/office/drawing/2016/5/9/chartex" xmlns:cx4="http://schemas.microsoft.com/office/drawing/2016/5/10/chartex" xmlns:cx5="http://schemas.microsoft.com/office/drawing/2016/5/11/chartex" xmlns:cx6="http://schemas.microsoft.com/office/drawing/2016/5/12/chartex" xmlns:cx7="http://schemas.microsoft.com/office/drawing/2016/5/13/chartex" xmlns:cx8="http://schemas.microsoft.com/office/drawing/2016/5/14/chartex" xmlns:mc="http://schemas.openxmlformats.org/markup-compatibility/2006" xmlns:aink="http://schemas.microsoft.com/office/drawing/2016/ink" xmlns:am3d="http://schemas.microsoft.com/office/drawing/2017/model3d" xmlns:o="urn:schemas-microsoft-com:office:office" xmlns:oel="http://schemas.microsoft.com/office/2019/extlst" xmlns:r="http://schemas.openxmlformats.org/officeDocument/2006/relationships" xmlns:m="http://schemas.openxmlformats.org/officeDocument/2006/math" xmlns:v="urn:schemas-microsoft-com:vml" xmlns:wp14="http://schemas.microsoft.com/office/word/2010/wordprocessingDrawing" xmlns:wp="http://schemas.openxmlformats.org/drawingml/2006/wordprocessingDrawing" xmlns:w10="urn:schemas-microsoft-com:office:word" xmlns:w="http://schemas.openxmlformats.org/wordprocessingml/2006/main" xmlns:w14="http://schemas.microsoft.com/office/word/2010/wordml" xmlns:w15="http://schemas.microsoft.com/office/word/2012/wordml" xmlns:w16cei="http://schemas.microsoft.com/office/word/2026/wordml/cei" xmlns:w16cex="http://schemas.microsoft.com/office/word/2018/wordml/cex" xmlns:w16cid="http://schemas.microsoft.com/office/word/2016/wordml/cid" xmlns:w16="http://schemas.microsoft.com/office/word/2018/wordml" xmlns:w16du="http://schemas.microsoft.com/office/word/2023/wordml/word16du" xmlns:w16sdtdh="http://schemas.microsoft.com/office/word/2020/wordml/sdtdatahash" xmlns:w16sdtfl="http://schemas.microsoft.com/office/word/2024/wordml/sdtformatlock" xmlns:w16se="http://schemas.microsoft.com/office/word/2015/wordml/symex" xmlns:wpg="http://schemas.microsoft.com/office/word/2010/wordprocessingGroup" xmlns:wpi="http://schemas.microsoft.com/office/word/2010/wordprocessingInk" xmlns:wne="http://schemas.microsoft.com/office/word/2006/wordml" xmlns:wps="http://schemas.microsoft.com/office/word/2010/wordprocessingShape" mc:Ignorable="w14 w15 w16se w16cid w16 w16cex w16sdtdh w16sdtfl w16du wp14">
+<w:document xmlns:wpc="http://schemas.microsoft.com/office/word/2010/wordprocessingCanvas" xmlns:cx="http://schemas.microsoft.com/office/drawing/2014/chartex" xmlns:cx1="http://schemas.microsoft.com/office/drawing/2015/9/8/chartex" xmlns:cx2="http://schemas.microsoft.com/office/drawing/2015/10/21/chartex" xmlns:cx3="http://schemas.microsoft.com/office/drawing/2016/5/9/chartex" xmlns:cx4="http://schemas.microsoft.com/office/drawing/2016/5/10/chartex" xmlns:cx5="http://schemas.microsoft.com/office/drawing/2016/5/11/chartex" xmlns:cx6="http://schemas.microsoft.com/office/drawing/2016/5/12/chartex" xmlns:cx7="http://schemas.microsoft.com/office/drawing/2016/5/13/chartex" xmlns:cx8="http://schemas.microsoft.com/office/drawing/2016/5/14/chartex" xmlns:mc="http://schemas.openxmlformats.org/markup-compatibility/2006" xmlns:aink="http://schemas.microsoft.com/office/drawing/2016/ink" xmlns:am3d="http://schemas.microsoft.com/office/drawing/2017/model3d" xmlns:o="urn:schemas-microsoft-com:office:office" xmlns:oel="http://schemas.microsoft.com/office/2019/extlst" xmlns:r="http://schemas.openxmlformats.org/officeDocument/2006/relationships" xmlns:m="http://schemas.openxmlformats.org/officeDocument/2006/math" xmlns:v="urn:schemas-microsoft-com:vml" xmlns:wp14="http://schemas.microsoft.com/office/word/2010/wordprocessingDrawing" xmlns:wp="http://schemas.openxmlformats.org/drawingml/2006/wordprocessingDrawing" xmlns:w10="urn:schemas-microsoft-com:office:word" xmlns:w="http://schemas.openxmlformats.org/wordprocessingml/2006/main" xmlns:w14="http://schemas.microsoft.com/office/word/2010/wordml" xmlns:w15="http://schemas.microsoft.com/office/word/2012/wordml" xmlns:w16cex="http://schemas.microsoft.com/office/word/2018/wordml/cex" xmlns:w16cid="http://schemas.microsoft.com/office/word/2016/wordml/cid" xmlns:w16="http://schemas.microsoft.com/office/word/2018/wordml" xmlns:w16du="http://schemas.microsoft.com/office/word/2023/wordml/word16du" xmlns:w16sdtdh="http://schemas.microsoft.com/office/word/2020/wordml/sdtdatahash" xmlns:w16sdtfl="http://schemas.microsoft.com/office/word/2024/wordml/sdtformatlock" xmlns:w16se="http://schemas.microsoft.com/office/word/2015/wordml/symex" xmlns:wpg="http://schemas.microsoft.com/office/word/2010/wordprocessingGroup" xmlns:wpi="http://schemas.microsoft.com/office/word/2010/wordprocessingInk" xmlns:wne="http://schemas.microsoft.com/office/word/2006/wordml" xmlns:wps="http://schemas.microsoft.com/office/word/2010/wordprocessingShape" mc:Ignorable="w14 w15 w16se w16cid w16 w16cex w16sdtdh w16sdtfl w16du wp14">
   <w:body>
     <w:p>
       <w:pPr>
@@ -97,7 +97,7 @@
               </wp:anchor>
             </w:drawing>
           </mc:Choice>
-          <mc:Fallback>
+          <mc:Fallback xmlns:w16cei="http://schemas.microsoft.com/office/word/2026/wordml/cei">
             <w:pict>
               <v:roundrect w14:anchorId="6C37F0BE" id="Retângulo: Cantos Arredondados 1" o:spid="_x0000_s1026" style="position:absolute;margin-left:0;margin-top:.6pt;width:549pt;height:24pt;z-index:-251657216;visibility:visible;mso-wrap-style:square;mso-height-percent:0;mso-wrap-distance-left:9pt;mso-wrap-distance-top:0;mso-wrap-distance-right:9pt;mso-wrap-distance-bottom:0;mso-position-horizontal:center;mso-position-horizontal-relative:margin;mso-position-vertical:absolute;mso-position-vertical-relative:text;mso-height-percent:0;mso-height-relative:margin;v-text-anchor:middle" arcsize="10923f" o:gfxdata="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" fillcolor="#a91e57" stroked="f" strokeweight="1pt">
                 <v:stroke joinstyle="miter"/>
@@ -3448,7 +3448,17 @@
                                 <w:sz w:val="16"/>
                                 <w:szCs w:val="16"/>
                               </w:rPr>
-                              <w:t xml:space="preserve">  VALOR</w:t>
+                              <w:t xml:space="preserve">  </w:t>
+                            </w:r>
+                            <w:r>
+                              <w:rPr>
+                                <w:b/>
+                                <w:bCs/>
+                                <w:color w:val="A91E57"/>
+                                <w:sz w:val="16"/>
+                                <w:szCs w:val="16"/>
+                              </w:rPr>
+                              <w:t>VALOR</w:t>
                             </w:r>
                             <w:proofErr w:type="gramEnd"/>
                             <w:r>
@@ -3459,7 +3469,7 @@
                                 <w:sz w:val="16"/>
                                 <w:szCs w:val="16"/>
                               </w:rPr>
-                              <w:t xml:space="preserve"> DA MENSALIDADE PARA BENEFICIÁRIOS CUJA CONTRATAÇÃO SEJA NA MODALIDADE FAMILIAR</w:t>
+                              <w:t xml:space="preserve"> DA MENSALIDADE PARA BENEFICIÁRIOS CUJA CONTRATAÇÃO SEJA NA MODALIDADE UNITÁRIA</w:t>
                             </w:r>
                           </w:p>
                         </w:txbxContent>
@@ -3527,7 +3537,17 @@
                           <w:sz w:val="16"/>
                           <w:szCs w:val="16"/>
                         </w:rPr>
-                        <w:t xml:space="preserve">  VALOR</w:t>
+                        <w:t xml:space="preserve">  </w:t>
+                      </w:r>
+                      <w:r>
+                        <w:rPr>
+                          <w:b/>
+                          <w:bCs/>
+                          <w:color w:val="A91E57"/>
+                          <w:sz w:val="16"/>
+                          <w:szCs w:val="16"/>
+                        </w:rPr>
+                        <w:t>VALOR</w:t>
                       </w:r>
                       <w:proofErr w:type="gramEnd"/>
                       <w:r>
@@ -3538,7 +3558,7 @@
                           <w:sz w:val="16"/>
                           <w:szCs w:val="16"/>
                         </w:rPr>
-                        <w:t xml:space="preserve"> DA MENSALIDADE PARA BENEFICIÁRIOS CUJA CONTRATAÇÃO SEJA NA MODALIDADE FAMILIAR</w:t>
+                        <w:t xml:space="preserve"> DA MENSALIDADE PARA BENEFICIÁRIOS CUJA CONTRATAÇÃO SEJA NA MODALIDADE UNITÁRIA</w:t>
                       </w:r>
                     </w:p>
                   </w:txbxContent>
@@ -3636,13 +3656,13 @@
               <w:rPr>
                 <w:rFonts w:cstheme="minorHAnsi"/>
               </w:rPr>
-              <w:t xml:space="preserve">.1 CONTRATAÇÃO </w:t>
-            </w:r>
-            <w:r>
-              <w:rPr>
-                <w:rFonts w:cstheme="minorHAnsi"/>
-              </w:rPr>
-              <w:t>GRUPO FAMILIAR UNIFÁCIL</w:t>
+              <w:t xml:space="preserve">.1 </w:t>
+            </w:r>
+            <w:r>
+              <w:rPr>
+                <w:rFonts w:cstheme="minorHAnsi"/>
+              </w:rPr>
+              <w:t>CONTRATAÇÃO UNITÁRIA UNIFÁCIL</w:t>
             </w:r>
           </w:p>
         </w:tc>
@@ -3734,13 +3754,13 @@
               <w:rPr>
                 <w:rFonts w:cstheme="minorHAnsi"/>
               </w:rPr>
-              <w:t xml:space="preserve">.2 CONTRATAÇÃO </w:t>
-            </w:r>
-            <w:r>
-              <w:rPr>
-                <w:rFonts w:cstheme="minorHAnsi"/>
-              </w:rPr>
-              <w:t>GRUPO FAMILIAR UNIPART ENFERMARIA</w:t>
+              <w:t xml:space="preserve">.2 </w:t>
+            </w:r>
+            <w:r>
+              <w:rPr>
+                <w:rFonts w:cstheme="minorHAnsi"/>
+              </w:rPr>
+              <w:t>CONTRATAÇÃO UNITÁRIA UNIPART ENFERMARIA</w:t>
             </w:r>
           </w:p>
         </w:tc>
@@ -3832,13 +3852,13 @@
               <w:rPr>
                 <w:rFonts w:cstheme="minorHAnsi"/>
               </w:rPr>
-              <w:t xml:space="preserve">.3 CONTRATAÇÃO </w:t>
-            </w:r>
-            <w:r>
-              <w:rPr>
-                <w:rFonts w:cstheme="minorHAnsi"/>
-              </w:rPr>
-              <w:t>GRUPO FAMILIAR UNIPART APARTAMENTO</w:t>
+              <w:t xml:space="preserve">.3 </w:t>
+            </w:r>
+            <w:r>
+              <w:rPr>
+                <w:rFonts w:cstheme="minorHAnsi"/>
+              </w:rPr>
+              <w:t>CONTRATAÇÃO UNITÁRIA UNIPART APARTAMENTO</w:t>
             </w:r>
           </w:p>
         </w:tc>
@@ -8016,6 +8036,17 @@
       <w:pPr>
         <w:jc w:val="both"/>
       </w:pPr>
+      <w:r>
+        <w:t xml:space="preserve">f) filhos </w:t>
+      </w:r>
+      <w:proofErr w:type="spellStart"/>
+      <w:r>
+        <w:t>comprovamente</w:t>
+      </w:r>
+      <w:proofErr w:type="spellEnd"/>
+      <w:r>
+        <w:t xml:space="preserve"> inválidos, sem limite de idade.</w:t>
+      </w:r>
     </w:p>
     <w:p>
       <w:pPr>
@@ -9837,99 +9868,7 @@
           <w:tab w:val="right" w:pos="10466"/>
         </w:tabs>
         <w:jc w:val="center"/>
-        <w:rPr>
-          <w:b/>
-          <w:bCs/>
-        </w:rPr>
-      </w:pPr>
-    </w:p>
-    <w:p>
-      <w:pPr>
-        <w:tabs>
-          <w:tab w:val="right" w:pos="10466"/>
-        </w:tabs>
-        <w:jc w:val="center"/>
-        <w:rPr>
-          <w:b/>
-          <w:bCs/>
-        </w:rPr>
-      </w:pPr>
-      <w:r>
-        <w:rPr>
-          <w:b/>
-          <w:bCs/>
-        </w:rPr>
-        <w:t>______________________________________________________</w:t>
-      </w:r>
-    </w:p>
-    <w:p>
-      <w:pPr>
-        <w:tabs>
-          <w:tab w:val="right" w:pos="10466"/>
-        </w:tabs>
-        <w:jc w:val="center"/>
-        <w:rPr>
-          <w:b/>
-          <w:bCs/>
-        </w:rPr>
-      </w:pPr>
-      <w:r>
-        <w:rPr>
-          <w:b/>
-          <w:bCs/>
-        </w:rPr>
-        <w:t>Local e Data</w:t>
-      </w:r>
-    </w:p>
-    <w:p>
-      <w:pPr>
-        <w:tabs>
-          <w:tab w:val="right" w:pos="10466"/>
-        </w:tabs>
-        <w:jc w:val="center"/>
-      </w:pPr>
-    </w:p>
-    <w:p>
-      <w:pPr>
-        <w:tabs>
-          <w:tab w:val="right" w:pos="10466"/>
-        </w:tabs>
-        <w:jc w:val="center"/>
-      </w:pPr>
-    </w:p>
-    <w:p>
-      <w:pPr>
-        <w:tabs>
-          <w:tab w:val="right" w:pos="10466"/>
-        </w:tabs>
-        <w:jc w:val="center"/>
-        <w:rPr>
-          <w:b/>
-          <w:bCs/>
-        </w:rPr>
-      </w:pPr>
-      <w:r>
-        <w:rPr>
-          <w:b/>
-          <w:bCs/>
-        </w:rPr>
-        <w:t>________________________________________________________</w:t>
-      </w:r>
-    </w:p>
-    <w:p>
-      <w:pPr>
-        <w:tabs>
-          <w:tab w:val="right" w:pos="10466"/>
-        </w:tabs>
-        <w:jc w:val="center"/>
-      </w:pPr>
-      <w:r>
-        <w:rPr>
-          <w:b/>
-          <w:bCs/>
-        </w:rPr>
-        <w:t>Assinatura do Cliente</w:t>
-      </w:r>
+      </w:pPr>
     </w:p>
     <w:sectPr>
       <w:headerReference w:type="even" r:id="rId11"/>
@@ -9948,7 +9887,7 @@
 </file>
 
 <file path=word/endnotes.xml><?xml version="1.0" encoding="utf-8"?>
-<w:endnotes xmlns:wpc="http://schemas.microsoft.com/office/word/2010/wordprocessingCanvas" xmlns:cx="http://schemas.microsoft.com/office/drawing/2014/chartex" xmlns:cx1="http://schemas.microsoft.com/office/drawing/2015/9/8/chartex" xmlns:cx2="http://schemas.microsoft.com/office/drawing/2015/10/21/chartex" xmlns:cx3="http://schemas.microsoft.com/office/drawing/2016/5/9/chartex" xmlns:cx4="http://schemas.microsoft.com/office/drawing/2016/5/10/chartex" xmlns:cx5="http://schemas.microsoft.com/office/drawing/2016/5/11/chartex" xmlns:cx6="http://schemas.microsoft.com/office/drawing/2016/5/12/chartex" xmlns:cx7="http://schemas.microsoft.com/office/drawing/2016/5/13/chartex" xmlns:cx8="http://schemas.microsoft.com/office/drawing/2016/5/14/chartex" xmlns:mc="http://schemas.openxmlformats.org/markup-compatibility/2006" xmlns:aink="http://schemas.microsoft.com/office/drawing/2016/ink" xmlns:am3d="http://schemas.microsoft.com/office/drawing/2017/model3d" xmlns:o="urn:schemas-microsoft-com:office:office" xmlns:oel="http://schemas.microsoft.com/office/2019/extlst" xmlns:r="http://schemas.openxmlformats.org/officeDocument/2006/relationships" xmlns:m="http://schemas.openxmlformats.org/officeDocument/2006/math" xmlns:v="urn:schemas-microsoft-com:vml" xmlns:wp14="http://schemas.microsoft.com/office/word/2010/wordprocessingDrawing" xmlns:wp="http://schemas.openxmlformats.org/drawingml/2006/wordprocessingDrawing" xmlns:w10="urn:schemas-microsoft-com:office:word" xmlns:w="http://schemas.openxmlformats.org/wordprocessingml/2006/main" xmlns:w14="http://schemas.microsoft.com/office/word/2010/wordml" xmlns:w15="http://schemas.microsoft.com/office/word/2012/wordml" xmlns:w16cei="http://schemas.microsoft.com/office/word/2026/wordml/cei" xmlns:w16cex="http://schemas.microsoft.com/office/word/2018/wordml/cex" xmlns:w16cid="http://schemas.microsoft.com/office/word/2016/wordml/cid" xmlns:w16="http://schemas.microsoft.com/office/word/2018/wordml" xmlns:w16du="http://schemas.microsoft.com/office/word/2023/wordml/word16du" xmlns:w16sdtdh="http://schemas.microsoft.com/office/word/2020/wordml/sdtdatahash" xmlns:w16sdtfl="http://schemas.microsoft.com/office/word/2024/wordml/sdtformatlock" xmlns:w16se="http://schemas.microsoft.com/office/word/2015/wordml/symex" xmlns:wpg="http://schemas.microsoft.com/office/word/2010/wordprocessingGroup" xmlns:wpi="http://schemas.microsoft.com/office/word/2010/wordprocessingInk" xmlns:wne="http://schemas.microsoft.com/office/word/2006/wordml" xmlns:wps="http://schemas.microsoft.com/office/word/2010/wordprocessingShape" mc:Ignorable="w14 w15 w16se w16cid w16 w16cex w16sdtdh w16sdtfl w16du wp14">
+<w:endnotes xmlns:wpc="http://schemas.microsoft.com/office/word/2010/wordprocessingCanvas" xmlns:cx="http://schemas.microsoft.com/office/drawing/2014/chartex" xmlns:cx1="http://schemas.microsoft.com/office/drawing/2015/9/8/chartex" xmlns:cx2="http://schemas.microsoft.com/office/drawing/2015/10/21/chartex" xmlns:cx3="http://schemas.microsoft.com/office/drawing/2016/5/9/chartex" xmlns:cx4="http://schemas.microsoft.com/office/drawing/2016/5/10/chartex" xmlns:cx5="http://schemas.microsoft.com/office/drawing/2016/5/11/chartex" xmlns:cx6="http://schemas.microsoft.com/office/drawing/2016/5/12/chartex" xmlns:cx7="http://schemas.microsoft.com/office/drawing/2016/5/13/chartex" xmlns:cx8="http://schemas.microsoft.com/office/drawing/2016/5/14/chartex" xmlns:mc="http://schemas.openxmlformats.org/markup-compatibility/2006" xmlns:aink="http://schemas.microsoft.com/office/drawing/2016/ink" xmlns:am3d="http://schemas.microsoft.com/office/drawing/2017/model3d" xmlns:o="urn:schemas-microsoft-com:office:office" xmlns:oel="http://schemas.microsoft.com/office/2019/extlst" xmlns:r="http://schemas.openxmlformats.org/officeDocument/2006/relationships" xmlns:m="http://schemas.openxmlformats.org/officeDocument/2006/math" xmlns:v="urn:schemas-microsoft-com:vml" xmlns:wp14="http://schemas.microsoft.com/office/word/2010/wordprocessingDrawing" xmlns:wp="http://schemas.openxmlformats.org/drawingml/2006/wordprocessingDrawing" xmlns:w10="urn:schemas-microsoft-com:office:word" xmlns:w="http://schemas.openxmlformats.org/wordprocessingml/2006/main" xmlns:w14="http://schemas.microsoft.com/office/word/2010/wordml" xmlns:w15="http://schemas.microsoft.com/office/word/2012/wordml" xmlns:w16cex="http://schemas.microsoft.com/office/word/2018/wordml/cex" xmlns:w16cid="http://schemas.microsoft.com/office/word/2016/wordml/cid" xmlns:w16="http://schemas.microsoft.com/office/word/2018/wordml" xmlns:w16du="http://schemas.microsoft.com/office/word/2023/wordml/word16du" xmlns:w16sdtdh="http://schemas.microsoft.com/office/word/2020/wordml/sdtdatahash" xmlns:w16sdtfl="http://schemas.microsoft.com/office/word/2024/wordml/sdtformatlock" xmlns:w16se="http://schemas.microsoft.com/office/word/2015/wordml/symex" xmlns:wpg="http://schemas.microsoft.com/office/word/2010/wordprocessingGroup" xmlns:wpi="http://schemas.microsoft.com/office/word/2010/wordprocessingInk" xmlns:wne="http://schemas.microsoft.com/office/word/2006/wordml" xmlns:wps="http://schemas.microsoft.com/office/word/2010/wordprocessingShape" mc:Ignorable="w14 w15 w16se w16cid w16 w16cex w16sdtdh w16sdtfl w16du wp14">
   <w:endnote w:type="separator" w:id="-1">
     <w:p>
       <w:pPr>
@@ -9973,7 +9912,7 @@
 </file>
 
 <file path=word/footer1.xml><?xml version="1.0" encoding="utf-8"?>
-<w:ftr xmlns:wpc="http://schemas.microsoft.com/office/word/2010/wordprocessingCanvas" xmlns:cx="http://schemas.microsoft.com/office/drawing/2014/chartex" xmlns:cx1="http://schemas.microsoft.com/office/drawing/2015/9/8/chartex" xmlns:cx2="http://schemas.microsoft.com/office/drawing/2015/10/21/chartex" xmlns:cx3="http://schemas.microsoft.com/office/drawing/2016/5/9/chartex" xmlns:cx4="http://schemas.microsoft.com/office/drawing/2016/5/10/chartex" xmlns:cx5="http://schemas.microsoft.com/office/drawing/2016/5/11/chartex" xmlns:cx6="http://schemas.microsoft.com/office/drawing/2016/5/12/chartex" xmlns:cx7="http://schemas.microsoft.com/office/drawing/2016/5/13/chartex" xmlns:cx8="http://schemas.microsoft.com/office/drawing/2016/5/14/chartex" xmlns:mc="http://schemas.openxmlformats.org/markup-compatibility/2006" xmlns:aink="http://schemas.microsoft.com/office/drawing/2016/ink" xmlns:am3d="http://schemas.microsoft.com/office/drawing/2017/model3d" xmlns:o="urn:schemas-microsoft-com:office:office" xmlns:oel="http://schemas.microsoft.com/office/2019/extlst" xmlns:r="http://schemas.openxmlformats.org/officeDocument/2006/relationships" xmlns:m="http://schemas.openxmlformats.org/officeDocument/2006/math" xmlns:v="urn:schemas-microsoft-com:vml" xmlns:wp14="http://schemas.microsoft.com/office/word/2010/wordprocessingDrawing" xmlns:wp="http://schemas.openxmlformats.org/drawingml/2006/wordprocessingDrawing" xmlns:w10="urn:schemas-microsoft-com:office:word" xmlns:w="http://schemas.openxmlformats.org/wordprocessingml/2006/main" xmlns:w14="http://schemas.microsoft.com/office/word/2010/wordml" xmlns:w15="http://schemas.microsoft.com/office/word/2012/wordml" xmlns:w16cei="http://schemas.microsoft.com/office/word/2026/wordml/cei" xmlns:w16cex="http://schemas.microsoft.com/office/word/2018/wordml/cex" xmlns:w16cid="http://schemas.microsoft.com/office/word/2016/wordml/cid" xmlns:w16="http://schemas.microsoft.com/office/word/2018/wordml" xmlns:w16du="http://schemas.microsoft.com/office/word/2023/wordml/word16du" xmlns:w16sdtdh="http://schemas.microsoft.com/office/word/2020/wordml/sdtdatahash" xmlns:w16sdtfl="http://schemas.microsoft.com/office/word/2024/wordml/sdtformatlock" xmlns:w16se="http://schemas.microsoft.com/office/word/2015/wordml/symex" xmlns:wpg="http://schemas.microsoft.com/office/word/2010/wordprocessingGroup" xmlns:wpi="http://schemas.microsoft.com/office/word/2010/wordprocessingInk" xmlns:wne="http://schemas.microsoft.com/office/word/2006/wordml" xmlns:wps="http://schemas.microsoft.com/office/word/2010/wordprocessingShape" mc:Ignorable="w14 w15 w16se w16cid w16 w16cex w16sdtdh w16sdtfl w16du wp14">
+<w:ftr xmlns:wpc="http://schemas.microsoft.com/office/word/2010/wordprocessingCanvas" xmlns:cx="http://schemas.microsoft.com/office/drawing/2014/chartex" xmlns:cx1="http://schemas.microsoft.com/office/drawing/2015/9/8/chartex" xmlns:cx2="http://schemas.microsoft.com/office/drawing/2015/10/21/chartex" xmlns:cx3="http://schemas.microsoft.com/office/drawing/2016/5/9/chartex" xmlns:cx4="http://schemas.microsoft.com/office/drawing/2016/5/10/chartex" xmlns:cx5="http://schemas.microsoft.com/office/drawing/2016/5/11/chartex" xmlns:cx6="http://schemas.microsoft.com/office/drawing/2016/5/12/chartex" xmlns:cx7="http://schemas.microsoft.com/office/drawing/2016/5/13/chartex" xmlns:cx8="http://schemas.microsoft.com/office/drawing/2016/5/14/chartex" xmlns:mc="http://schemas.openxmlformats.org/markup-compatibility/2006" xmlns:aink="http://schemas.microsoft.com/office/drawing/2016/ink" xmlns:am3d="http://schemas.microsoft.com/office/drawing/2017/model3d" xmlns:o="urn:schemas-microsoft-com:office:office" xmlns:oel="http://schemas.microsoft.com/office/2019/extlst" xmlns:r="http://schemas.openxmlformats.org/officeDocument/2006/relationships" xmlns:m="http://schemas.openxmlformats.org/officeDocument/2006/math" xmlns:v="urn:schemas-microsoft-com:vml" xmlns:wp14="http://schemas.microsoft.com/office/word/2010/wordprocessingDrawing" xmlns:wp="http://schemas.openxmlformats.org/drawingml/2006/wordprocessingDrawing" xmlns:w10="urn:schemas-microsoft-com:office:word" xmlns:w="http://schemas.openxmlformats.org/wordprocessingml/2006/main" xmlns:w14="http://schemas.microsoft.com/office/word/2010/wordml" xmlns:w15="http://schemas.microsoft.com/office/word/2012/wordml" xmlns:w16cex="http://schemas.microsoft.com/office/word/2018/wordml/cex" xmlns:w16cid="http://schemas.microsoft.com/office/word/2016/wordml/cid" xmlns:w16="http://schemas.microsoft.com/office/word/2018/wordml" xmlns:w16du="http://schemas.microsoft.com/office/word/2023/wordml/word16du" xmlns:w16sdtdh="http://schemas.microsoft.com/office/word/2020/wordml/sdtdatahash" xmlns:w16sdtfl="http://schemas.microsoft.com/office/word/2024/wordml/sdtformatlock" xmlns:w16se="http://schemas.microsoft.com/office/word/2015/wordml/symex" xmlns:wpg="http://schemas.microsoft.com/office/word/2010/wordprocessingGroup" xmlns:wpi="http://schemas.microsoft.com/office/word/2010/wordprocessingInk" xmlns:wne="http://schemas.microsoft.com/office/word/2006/wordml" xmlns:wps="http://schemas.microsoft.com/office/word/2010/wordprocessingShape" mc:Ignorable="w14 w15 w16se w16cid w16 w16cex w16sdtdh w16sdtfl w16du wp14">
   <w:p>
     <w:pPr>
       <w:pStyle w:val="Rodap"/>
@@ -9983,7 +9922,7 @@
 </file>
 
 <file path=word/footer2.xml><?xml version="1.0" encoding="utf-8"?>
-<w:ftr xmlns:wpc="http://schemas.microsoft.com/office/word/2010/wordprocessingCanvas" xmlns:cx="http://schemas.microsoft.com/office/drawing/2014/chartex" xmlns:cx1="http://schemas.microsoft.com/office/drawing/2015/9/8/chartex" xmlns:cx2="http://schemas.microsoft.com/office/drawing/2015/10/21/chartex" xmlns:cx3="http://schemas.microsoft.com/office/drawing/2016/5/9/chartex" xmlns:cx4="http://schemas.microsoft.com/office/drawing/2016/5/10/chartex" xmlns:cx5="http://schemas.microsoft.com/office/drawing/2016/5/11/chartex" xmlns:cx6="http://schemas.microsoft.com/office/drawing/2016/5/12/chartex" xmlns:cx7="http://schemas.microsoft.com/office/drawing/2016/5/13/chartex" xmlns:cx8="http://schemas.microsoft.com/office/drawing/2016/5/14/chartex" xmlns:mc="http://schemas.openxmlformats.org/markup-compatibility/2006" xmlns:aink="http://schemas.microsoft.com/office/drawing/2016/ink" xmlns:am3d="http://schemas.microsoft.com/office/drawing/2017/model3d" xmlns:o="urn:schemas-microsoft-com:office:office" xmlns:oel="http://schemas.microsoft.com/office/2019/extlst" xmlns:r="http://schemas.openxmlformats.org/officeDocument/2006/relationships" xmlns:m="http://schemas.openxmlformats.org/officeDocument/2006/math" xmlns:v="urn:schemas-microsoft-com:vml" xmlns:wp14="http://schemas.microsoft.com/office/word/2010/wordprocessingDrawing" xmlns:wp="http://schemas.openxmlformats.org/drawingml/2006/wordprocessingDrawing" xmlns:w10="urn:schemas-microsoft-com:office:word" xmlns:w="http://schemas.openxmlformats.org/wordprocessingml/2006/main" xmlns:w14="http://schemas.microsoft.com/office/word/2010/wordml" xmlns:w15="http://schemas.microsoft.com/office/word/2012/wordml" xmlns:w16cei="http://schemas.microsoft.com/office/word/2026/wordml/cei" xmlns:w16cex="http://schemas.microsoft.com/office/word/2018/wordml/cex" xmlns:w16cid="http://schemas.microsoft.com/office/word/2016/wordml/cid" xmlns:w16="http://schemas.microsoft.com/office/word/2018/wordml" xmlns:w16du="http://schemas.microsoft.com/office/word/2023/wordml/word16du" xmlns:w16sdtdh="http://schemas.microsoft.com/office/word/2020/wordml/sdtdatahash" xmlns:w16sdtfl="http://schemas.microsoft.com/office/word/2024/wordml/sdtformatlock" xmlns:w16se="http://schemas.microsoft.com/office/word/2015/wordml/symex" xmlns:wpg="http://schemas.microsoft.com/office/word/2010/wordprocessingGroup" xmlns:wpi="http://schemas.microsoft.com/office/word/2010/wordprocessingInk" xmlns:wne="http://schemas.microsoft.com/office/word/2006/wordml" xmlns:wps="http://schemas.microsoft.com/office/word/2010/wordprocessingShape" mc:Ignorable="w14 w15 w16se w16cid w16 w16cex w16sdtdh w16sdtfl w16du wp14">
+<w:ftr xmlns:wpc="http://schemas.microsoft.com/office/word/2010/wordprocessingCanvas" xmlns:cx="http://schemas.microsoft.com/office/drawing/2014/chartex" xmlns:cx1="http://schemas.microsoft.com/office/drawing/2015/9/8/chartex" xmlns:cx2="http://schemas.microsoft.com/office/drawing/2015/10/21/chartex" xmlns:cx3="http://schemas.microsoft.com/office/drawing/2016/5/9/chartex" xmlns:cx4="http://schemas.microsoft.com/office/drawing/2016/5/10/chartex" xmlns:cx5="http://schemas.microsoft.com/office/drawing/2016/5/11/chartex" xmlns:cx6="http://schemas.microsoft.com/office/drawing/2016/5/12/chartex" xmlns:cx7="http://schemas.microsoft.com/office/drawing/2016/5/13/chartex" xmlns:cx8="http://schemas.microsoft.com/office/drawing/2016/5/14/chartex" xmlns:mc="http://schemas.openxmlformats.org/markup-compatibility/2006" xmlns:aink="http://schemas.microsoft.com/office/drawing/2016/ink" xmlns:am3d="http://schemas.microsoft.com/office/drawing/2017/model3d" xmlns:o="urn:schemas-microsoft-com:office:office" xmlns:oel="http://schemas.microsoft.com/office/2019/extlst" xmlns:r="http://schemas.openxmlformats.org/officeDocument/2006/relationships" xmlns:m="http://schemas.openxmlformats.org/officeDocument/2006/math" xmlns:v="urn:schemas-microsoft-com:vml" xmlns:wp14="http://schemas.microsoft.com/office/word/2010/wordprocessingDrawing" xmlns:wp="http://schemas.openxmlformats.org/drawingml/2006/wordprocessingDrawing" xmlns:w10="urn:schemas-microsoft-com:office:word" xmlns:w="http://schemas.openxmlformats.org/wordprocessingml/2006/main" xmlns:w14="http://schemas.microsoft.com/office/word/2010/wordml" xmlns:w15="http://schemas.microsoft.com/office/word/2012/wordml" xmlns:w16cex="http://schemas.microsoft.com/office/word/2018/wordml/cex" xmlns:w16cid="http://schemas.microsoft.com/office/word/2016/wordml/cid" xmlns:w16="http://schemas.microsoft.com/office/word/2018/wordml" xmlns:w16du="http://schemas.microsoft.com/office/word/2023/wordml/word16du" xmlns:w16sdtdh="http://schemas.microsoft.com/office/word/2020/wordml/sdtdatahash" xmlns:w16sdtfl="http://schemas.microsoft.com/office/word/2024/wordml/sdtformatlock" xmlns:w16se="http://schemas.microsoft.com/office/word/2015/wordml/symex" xmlns:wpg="http://schemas.microsoft.com/office/word/2010/wordprocessingGroup" xmlns:wpi="http://schemas.microsoft.com/office/word/2010/wordprocessingInk" xmlns:wne="http://schemas.microsoft.com/office/word/2006/wordml" xmlns:wps="http://schemas.microsoft.com/office/word/2010/wordprocessingShape" mc:Ignorable="w14 w15 w16se w16cid w16 w16cex w16sdtdh w16sdtfl w16du wp14">
   <w:p>
     <w:pPr>
       <w:pStyle w:val="Rodap"/>
@@ -9993,7 +9932,7 @@
 </file>
 
 <file path=word/footer3.xml><?xml version="1.0" encoding="utf-8"?>
-<w:ftr xmlns:wpc="http://schemas.microsoft.com/office/word/2010/wordprocessingCanvas" xmlns:cx="http://schemas.microsoft.com/office/drawing/2014/chartex" xmlns:cx1="http://schemas.microsoft.com/office/drawing/2015/9/8/chartex" xmlns:cx2="http://schemas.microsoft.com/office/drawing/2015/10/21/chartex" xmlns:cx3="http://schemas.microsoft.com/office/drawing/2016/5/9/chartex" xmlns:cx4="http://schemas.microsoft.com/office/drawing/2016/5/10/chartex" xmlns:cx5="http://schemas.microsoft.com/office/drawing/2016/5/11/chartex" xmlns:cx6="http://schemas.microsoft.com/office/drawing/2016/5/12/chartex" xmlns:cx7="http://schemas.microsoft.com/office/drawing/2016/5/13/chartex" xmlns:cx8="http://schemas.microsoft.com/office/drawing/2016/5/14/chartex" xmlns:mc="http://schemas.openxmlformats.org/markup-compatibility/2006" xmlns:aink="http://schemas.microsoft.com/office/drawing/2016/ink" xmlns:am3d="http://schemas.microsoft.com/office/drawing/2017/model3d" xmlns:o="urn:schemas-microsoft-com:office:office" xmlns:oel="http://schemas.microsoft.com/office/2019/extlst" xmlns:r="http://schemas.openxmlformats.org/officeDocument/2006/relationships" xmlns:m="http://schemas.openxmlformats.org/officeDocument/2006/math" xmlns:v="urn:schemas-microsoft-com:vml" xmlns:wp14="http://schemas.microsoft.com/office/word/2010/wordprocessingDrawing" xmlns:wp="http://schemas.openxmlformats.org/drawingml/2006/wordprocessingDrawing" xmlns:w10="urn:schemas-microsoft-com:office:word" xmlns:w="http://schemas.openxmlformats.org/wordprocessingml/2006/main" xmlns:w14="http://schemas.microsoft.com/office/word/2010/wordml" xmlns:w15="http://schemas.microsoft.com/office/word/2012/wordml" xmlns:w16cei="http://schemas.microsoft.com/office/word/2026/wordml/cei" xmlns:w16cex="http://schemas.microsoft.com/office/word/2018/wordml/cex" xmlns:w16cid="http://schemas.microsoft.com/office/word/2016/wordml/cid" xmlns:w16="http://schemas.microsoft.com/office/word/2018/wordml" xmlns:w16du="http://schemas.microsoft.com/office/word/2023/wordml/word16du" xmlns:w16sdtdh="http://schemas.microsoft.com/office/word/2020/wordml/sdtdatahash" xmlns:w16sdtfl="http://schemas.microsoft.com/office/word/2024/wordml/sdtformatlock" xmlns:w16se="http://schemas.microsoft.com/office/word/2015/wordml/symex" xmlns:wpg="http://schemas.microsoft.com/office/word/2010/wordprocessingGroup" xmlns:wpi="http://schemas.microsoft.com/office/word/2010/wordprocessingInk" xmlns:wne="http://schemas.microsoft.com/office/word/2006/wordml" xmlns:wps="http://schemas.microsoft.com/office/word/2010/wordprocessingShape" mc:Ignorable="w14 w15 w16se w16cid w16 w16cex w16sdtdh w16sdtfl w16du wp14">
+<w:ftr xmlns:wpc="http://schemas.microsoft.com/office/word/2010/wordprocessingCanvas" xmlns:cx="http://schemas.microsoft.com/office/drawing/2014/chartex" xmlns:cx1="http://schemas.microsoft.com/office/drawing/2015/9/8/chartex" xmlns:cx2="http://schemas.microsoft.com/office/drawing/2015/10/21/chartex" xmlns:cx3="http://schemas.microsoft.com/office/drawing/2016/5/9/chartex" xmlns:cx4="http://schemas.microsoft.com/office/drawing/2016/5/10/chartex" xmlns:cx5="http://schemas.microsoft.com/office/drawing/2016/5/11/chartex" xmlns:cx6="http://schemas.microsoft.com/office/drawing/2016/5/12/chartex" xmlns:cx7="http://schemas.microsoft.com/office/drawing/2016/5/13/chartex" xmlns:cx8="http://schemas.microsoft.com/office/drawing/2016/5/14/chartex" xmlns:mc="http://schemas.openxmlformats.org/markup-compatibility/2006" xmlns:aink="http://schemas.microsoft.com/office/drawing/2016/ink" xmlns:am3d="http://schemas.microsoft.com/office/drawing/2017/model3d" xmlns:o="urn:schemas-microsoft-com:office:office" xmlns:oel="http://schemas.microsoft.com/office/2019/extlst" xmlns:r="http://schemas.openxmlformats.org/officeDocument/2006/relationships" xmlns:m="http://schemas.openxmlformats.org/officeDocument/2006/math" xmlns:v="urn:schemas-microsoft-com:vml" xmlns:wp14="http://schemas.microsoft.com/office/word/2010/wordprocessingDrawing" xmlns:wp="http://schemas.openxmlformats.org/drawingml/2006/wordprocessingDrawing" xmlns:w10="urn:schemas-microsoft-com:office:word" xmlns:w="http://schemas.openxmlformats.org/wordprocessingml/2006/main" xmlns:w14="http://schemas.microsoft.com/office/word/2010/wordml" xmlns:w15="http://schemas.microsoft.com/office/word/2012/wordml" xmlns:w16cex="http://schemas.microsoft.com/office/word/2018/wordml/cex" xmlns:w16cid="http://schemas.microsoft.com/office/word/2016/wordml/cid" xmlns:w16="http://schemas.microsoft.com/office/word/2018/wordml" xmlns:w16du="http://schemas.microsoft.com/office/word/2023/wordml/word16du" xmlns:w16sdtdh="http://schemas.microsoft.com/office/word/2020/wordml/sdtdatahash" xmlns:w16sdtfl="http://schemas.microsoft.com/office/word/2024/wordml/sdtformatlock" xmlns:w16se="http://schemas.microsoft.com/office/word/2015/wordml/symex" xmlns:wpg="http://schemas.microsoft.com/office/word/2010/wordprocessingGroup" xmlns:wpi="http://schemas.microsoft.com/office/word/2010/wordprocessingInk" xmlns:wne="http://schemas.microsoft.com/office/word/2006/wordml" xmlns:wps="http://schemas.microsoft.com/office/word/2010/wordprocessingShape" mc:Ignorable="w14 w15 w16se w16cid w16 w16cex w16sdtdh w16sdtfl w16du wp14">
   <w:p>
     <w:pPr>
       <w:pStyle w:val="Rodap"/>
@@ -10003,7 +9942,7 @@
 </file>
 
 <file path=word/footnotes.xml><?xml version="1.0" encoding="utf-8"?>
-<w:footnotes xmlns:wpc="http://schemas.microsoft.com/office/word/2010/wordprocessingCanvas" xmlns:cx="http://schemas.microsoft.com/office/drawing/2014/chartex" xmlns:cx1="http://schemas.microsoft.com/office/drawing/2015/9/8/chartex" xmlns:cx2="http://schemas.microsoft.com/office/drawing/2015/10/21/chartex" xmlns:cx3="http://schemas.microsoft.com/office/drawing/2016/5/9/chartex" xmlns:cx4="http://schemas.microsoft.com/office/drawing/2016/5/10/chartex" xmlns:cx5="http://schemas.microsoft.com/office/drawing/2016/5/11/chartex" xmlns:cx6="http://schemas.microsoft.com/office/drawing/2016/5/12/chartex" xmlns:cx7="http://schemas.microsoft.com/office/drawing/2016/5/13/chartex" xmlns:cx8="http://schemas.microsoft.com/office/drawing/2016/5/14/chartex" xmlns:mc="http://schemas.openxmlformats.org/markup-compatibility/2006" xmlns:aink="http://schemas.microsoft.com/office/drawing/2016/ink" xmlns:am3d="http://schemas.microsoft.com/office/drawing/2017/model3d" xmlns:o="urn:schemas-microsoft-com:office:office" xmlns:oel="http://schemas.microsoft.com/office/2019/extlst" xmlns:r="http://schemas.openxmlformats.org/officeDocument/2006/relationships" xmlns:m="http://schemas.openxmlformats.org/officeDocument/2006/math" xmlns:v="urn:schemas-microsoft-com:vml" xmlns:wp14="http://schemas.microsoft.com/office/word/2010/wordprocessingDrawing" xmlns:wp="http://schemas.openxmlformats.org/drawingml/2006/wordprocessingDrawing" xmlns:w10="urn:schemas-microsoft-com:office:word" xmlns:w="http://schemas.openxmlformats.org/wordprocessingml/2006/main" xmlns:w14="http://schemas.microsoft.com/office/word/2010/wordml" xmlns:w15="http://schemas.microsoft.com/office/word/2012/wordml" xmlns:w16cei="http://schemas.microsoft.com/office/word/2026/wordml/cei" xmlns:w16cex="http://schemas.microsoft.com/office/word/2018/wordml/cex" xmlns:w16cid="http://schemas.microsoft.com/office/word/2016/wordml/cid" xmlns:w16="http://schemas.microsoft.com/office/word/2018/wordml" xmlns:w16du="http://schemas.microsoft.com/office/word/2023/wordml/word16du" xmlns:w16sdtdh="http://schemas.microsoft.com/office/word/2020/wordml/sdtdatahash" xmlns:w16sdtfl="http://schemas.microsoft.com/office/word/2024/wordml/sdtformatlock" xmlns:w16se="http://schemas.microsoft.com/office/word/2015/wordml/symex" xmlns:wpg="http://schemas.microsoft.com/office/word/2010/wordprocessingGroup" xmlns:wpi="http://schemas.microsoft.com/office/word/2010/wordprocessingInk" xmlns:wne="http://schemas.microsoft.com/office/word/2006/wordml" xmlns:wps="http://schemas.microsoft.com/office/word/2010/wordprocessingShape" mc:Ignorable="w14 w15 w16se w16cid w16 w16cex w16sdtdh w16sdtfl w16du wp14">
+<w:footnotes xmlns:wpc="http://schemas.microsoft.com/office/word/2010/wordprocessingCanvas" xmlns:cx="http://schemas.microsoft.com/office/drawing/2014/chartex" xmlns:cx1="http://schemas.microsoft.com/office/drawing/2015/9/8/chartex" xmlns:cx2="http://schemas.microsoft.com/office/drawing/2015/10/21/chartex" xmlns:cx3="http://schemas.microsoft.com/office/drawing/2016/5/9/chartex" xmlns:cx4="http://schemas.microsoft.com/office/drawing/2016/5/10/chartex" xmlns:cx5="http://schemas.microsoft.com/office/drawing/2016/5/11/chartex" xmlns:cx6="http://schemas.microsoft.com/office/drawing/2016/5/12/chartex" xmlns:cx7="http://schemas.microsoft.com/office/drawing/2016/5/13/chartex" xmlns:cx8="http://schemas.microsoft.com/office/drawing/2016/5/14/chartex" xmlns:mc="http://schemas.openxmlformats.org/markup-compatibility/2006" xmlns:aink="http://schemas.microsoft.com/office/drawing/2016/ink" xmlns:am3d="http://schemas.microsoft.com/office/drawing/2017/model3d" xmlns:o="urn:schemas-microsoft-com:office:office" xmlns:oel="http://schemas.microsoft.com/office/2019/extlst" xmlns:r="http://schemas.openxmlformats.org/officeDocument/2006/relationships" xmlns:m="http://schemas.openxmlformats.org/officeDocument/2006/math" xmlns:v="urn:schemas-microsoft-com:vml" xmlns:wp14="http://schemas.microsoft.com/office/word/2010/wordprocessingDrawing" xmlns:wp="http://schemas.openxmlformats.org/drawingml/2006/wordprocessingDrawing" xmlns:w10="urn:schemas-microsoft-com:office:word" xmlns:w="http://schemas.openxmlformats.org/wordprocessingml/2006/main" xmlns:w14="http://schemas.microsoft.com/office/word/2010/wordml" xmlns:w15="http://schemas.microsoft.com/office/word/2012/wordml" xmlns:w16cex="http://schemas.microsoft.com/office/word/2018/wordml/cex" xmlns:w16cid="http://schemas.microsoft.com/office/word/2016/wordml/cid" xmlns:w16="http://schemas.microsoft.com/office/word/2018/wordml" xmlns:w16du="http://schemas.microsoft.com/office/word/2023/wordml/word16du" xmlns:w16sdtdh="http://schemas.microsoft.com/office/word/2020/wordml/sdtdatahash" xmlns:w16sdtfl="http://schemas.microsoft.com/office/word/2024/wordml/sdtformatlock" xmlns:w16se="http://schemas.microsoft.com/office/word/2015/wordml/symex" xmlns:wpg="http://schemas.microsoft.com/office/word/2010/wordprocessingGroup" xmlns:wpi="http://schemas.microsoft.com/office/word/2010/wordprocessingInk" xmlns:wne="http://schemas.microsoft.com/office/word/2006/wordml" xmlns:wps="http://schemas.microsoft.com/office/word/2010/wordprocessingShape" mc:Ignorable="w14 w15 w16se w16cid w16 w16cex w16sdtdh w16sdtfl w16du wp14">
   <w:footnote w:type="separator" w:id="-1">
     <w:p>
       <w:pPr>
@@ -10028,7 +9967,7 @@
 </file>
 
 <file path=word/header1.xml><?xml version="1.0" encoding="utf-8"?>
-<w:hdr xmlns:wpc="http://schemas.microsoft.com/office/word/2010/wordprocessingCanvas" xmlns:cx="http://schemas.microsoft.com/office/drawing/2014/chartex" xmlns:cx1="http://schemas.microsoft.com/office/drawing/2015/9/8/chartex" xmlns:cx2="http://schemas.microsoft.com/office/drawing/2015/10/21/chartex" xmlns:cx3="http://schemas.microsoft.com/office/drawing/2016/5/9/chartex" xmlns:cx4="http://schemas.microsoft.com/office/drawing/2016/5/10/chartex" xmlns:cx5="http://schemas.microsoft.com/office/drawing/2016/5/11/chartex" xmlns:cx6="http://schemas.microsoft.com/office/drawing/2016/5/12/chartex" xmlns:cx7="http://schemas.microsoft.com/office/drawing/2016/5/13/chartex" xmlns:cx8="http://schemas.microsoft.com/office/drawing/2016/5/14/chartex" xmlns:mc="http://schemas.openxmlformats.org/markup-compatibility/2006" xmlns:aink="http://schemas.microsoft.com/office/drawing/2016/ink" xmlns:am3d="http://schemas.microsoft.com/office/drawing/2017/model3d" xmlns:o="urn:schemas-microsoft-com:office:office" xmlns:oel="http://schemas.microsoft.com/office/2019/extlst" xmlns:r="http://schemas.openxmlformats.org/officeDocument/2006/relationships" xmlns:m="http://schemas.openxmlformats.org/officeDocument/2006/math" xmlns:v="urn:schemas-microsoft-com:vml" xmlns:wp14="http://schemas.microsoft.com/office/word/2010/wordprocessingDrawing" xmlns:wp="http://schemas.openxmlformats.org/drawingml/2006/wordprocessingDrawing" xmlns:w10="urn:schemas-microsoft-com:office:word" xmlns:w="http://schemas.openxmlformats.org/wordprocessingml/2006/main" xmlns:w14="http://schemas.microsoft.com/office/word/2010/wordml" xmlns:w15="http://schemas.microsoft.com/office/word/2012/wordml" xmlns:w16cei="http://schemas.microsoft.com/office/word/2026/wordml/cei" xmlns:w16cex="http://schemas.microsoft.com/office/word/2018/wordml/cex" xmlns:w16cid="http://schemas.microsoft.com/office/word/2016/wordml/cid" xmlns:w16="http://schemas.microsoft.com/office/word/2018/wordml" xmlns:w16du="http://schemas.microsoft.com/office/word/2023/wordml/word16du" xmlns:w16sdtdh="http://schemas.microsoft.com/office/word/2020/wordml/sdtdatahash" xmlns:w16sdtfl="http://schemas.microsoft.com/office/word/2024/wordml/sdtformatlock" xmlns:w16se="http://schemas.microsoft.com/office/word/2015/wordml/symex" xmlns:wpg="http://schemas.microsoft.com/office/word/2010/wordprocessingGroup" xmlns:wpi="http://schemas.microsoft.com/office/word/2010/wordprocessingInk" xmlns:wne="http://schemas.microsoft.com/office/word/2006/wordml" xmlns:wps="http://schemas.microsoft.com/office/word/2010/wordprocessingShape" mc:Ignorable="w14 w15 w16se w16cid w16 w16cex w16sdtdh w16sdtfl w16du wp14">
+<w:hdr xmlns:wpc="http://schemas.microsoft.com/office/word/2010/wordprocessingCanvas" xmlns:cx="http://schemas.microsoft.com/office/drawing/2014/chartex" xmlns:cx1="http://schemas.microsoft.com/office/drawing/2015/9/8/chartex" xmlns:cx2="http://schemas.microsoft.com/office/drawing/2015/10/21/chartex" xmlns:cx3="http://schemas.microsoft.com/office/drawing/2016/5/9/chartex" xmlns:cx4="http://schemas.microsoft.com/office/drawing/2016/5/10/chartex" xmlns:cx5="http://schemas.microsoft.com/office/drawing/2016/5/11/chartex" xmlns:cx6="http://schemas.microsoft.com/office/drawing/2016/5/12/chartex" xmlns:cx7="http://schemas.microsoft.com/office/drawing/2016/5/13/chartex" xmlns:cx8="http://schemas.microsoft.com/office/drawing/2016/5/14/chartex" xmlns:mc="http://schemas.openxmlformats.org/markup-compatibility/2006" xmlns:aink="http://schemas.microsoft.com/office/drawing/2016/ink" xmlns:am3d="http://schemas.microsoft.com/office/drawing/2017/model3d" xmlns:o="urn:schemas-microsoft-com:office:office" xmlns:oel="http://schemas.microsoft.com/office/2019/extlst" xmlns:r="http://schemas.openxmlformats.org/officeDocument/2006/relationships" xmlns:m="http://schemas.openxmlformats.org/officeDocument/2006/math" xmlns:v="urn:schemas-microsoft-com:vml" xmlns:wp14="http://schemas.microsoft.com/office/word/2010/wordprocessingDrawing" xmlns:wp="http://schemas.openxmlformats.org/drawingml/2006/wordprocessingDrawing" xmlns:w10="urn:schemas-microsoft-com:office:word" xmlns:w="http://schemas.openxmlformats.org/wordprocessingml/2006/main" xmlns:w14="http://schemas.microsoft.com/office/word/2010/wordml" xmlns:w15="http://schemas.microsoft.com/office/word/2012/wordml" xmlns:w16cex="http://schemas.microsoft.com/office/word/2018/wordml/cex" xmlns:w16cid="http://schemas.microsoft.com/office/word/2016/wordml/cid" xmlns:w16="http://schemas.microsoft.com/office/word/2018/wordml" xmlns:w16du="http://schemas.microsoft.com/office/word/2023/wordml/word16du" xmlns:w16sdtdh="http://schemas.microsoft.com/office/word/2020/wordml/sdtdatahash" xmlns:w16sdtfl="http://schemas.microsoft.com/office/word/2024/wordml/sdtformatlock" xmlns:w16se="http://schemas.microsoft.com/office/word/2015/wordml/symex" xmlns:wpg="http://schemas.microsoft.com/office/word/2010/wordprocessingGroup" xmlns:wpi="http://schemas.microsoft.com/office/word/2010/wordprocessingInk" xmlns:wne="http://schemas.microsoft.com/office/word/2006/wordml" xmlns:wps="http://schemas.microsoft.com/office/word/2010/wordprocessingShape" mc:Ignorable="w14 w15 w16se w16cid w16 w16cex w16sdtdh w16sdtfl w16du wp14">
   <w:p>
     <w:pPr>
       <w:pStyle w:val="Cabealho"/>
@@ -10037,7 +9976,7 @@
       <w:rPr>
         <w:noProof/>
       </w:rPr>
-      <w:pict w14:anchorId="2DA0CFB1">
+      <w:pict w14:anchorId="1F25E5F1">
         <v:shapetype id="_x0000_t75" coordsize="21600,21600" o:spt="75" o:preferrelative="t" path="m@4@5l@4@11@9@11@9@5xe" filled="f" stroked="f">
           <v:stroke joinstyle="miter"/>
           <v:formulas>
@@ -10057,8 +9996,9 @@
           <v:path o:extrusionok="f" gradientshapeok="t" o:connecttype="rect"/>
           <o:lock v:ext="edit" aspectratio="t"/>
         </v:shapetype>
-        <v:shape id="WordPictureWatermark404685094" o:spid="_x0000_s1035" type="#_x0000_t75" style="position:absolute;margin-left:0;margin-top:0;width:595.35pt;height:842.1pt;z-index:-251657216;mso-position-horizontal:center;mso-position-horizontal-relative:margin;mso-position-vertical:center;mso-position-vertical-relative:margin" o:allowincell="f">
+        <v:shape id="WordPictureWatermark692647188" o:spid="_x0000_s1038" type="#_x0000_t75" style="position:absolute;margin-left:0;margin-top:0;width:595.35pt;height:842.1pt;z-index:-251657216;mso-position-horizontal:center;mso-position-horizontal-relative:margin;mso-position-vertical:center;mso-position-vertical-relative:margin" o:allowincell="f">
           <v:imagedata r:id="rId1" o:title="Marca Dágua - Termo SETCEMG"/>
+          <w10:wrap anchorx="margin" anchory="margin"/>
         </v:shape>
       </w:pict>
     </w:r>
@@ -10067,7 +10007,7 @@
 </file>
 
 <file path=word/header2.xml><?xml version="1.0" encoding="utf-8"?>
-<w:hdr xmlns:wpc="http://schemas.microsoft.com/office/word/2010/wordprocessingCanvas" xmlns:cx="http://schemas.microsoft.com/office/drawing/2014/chartex" xmlns:cx1="http://schemas.microsoft.com/office/drawing/2015/9/8/chartex" xmlns:cx2="http://schemas.microsoft.com/office/drawing/2015/10/21/chartex" xmlns:cx3="http://schemas.microsoft.com/office/drawing/2016/5/9/chartex" xmlns:cx4="http://schemas.microsoft.com/office/drawing/2016/5/10/chartex" xmlns:cx5="http://schemas.microsoft.com/office/drawing/2016/5/11/chartex" xmlns:cx6="http://schemas.microsoft.com/office/drawing/2016/5/12/chartex" xmlns:cx7="http://schemas.microsoft.com/office/drawing/2016/5/13/chartex" xmlns:cx8="http://schemas.microsoft.com/office/drawing/2016/5/14/chartex" xmlns:mc="http://schemas.openxmlformats.org/markup-compatibility/2006" xmlns:aink="http://schemas.microsoft.com/office/drawing/2016/ink" xmlns:am3d="http://schemas.microsoft.com/office/drawing/2017/model3d" xmlns:o="urn:schemas-microsoft-com:office:office" xmlns:oel="http://schemas.microsoft.com/office/2019/extlst" xmlns:r="http://schemas.openxmlformats.org/officeDocument/2006/relationships" xmlns:m="http://schemas.openxmlformats.org/officeDocument/2006/math" xmlns:v="urn:schemas-microsoft-com:vml" xmlns:wp14="http://schemas.microsoft.com/office/word/2010/wordprocessingDrawing" xmlns:wp="http://schemas.openxmlformats.org/drawingml/2006/wordprocessingDrawing" xmlns:w10="urn:schemas-microsoft-com:office:word" xmlns:w="http://schemas.openxmlformats.org/wordprocessingml/2006/main" xmlns:w14="http://schemas.microsoft.com/office/word/2010/wordml" xmlns:w15="http://schemas.microsoft.com/office/word/2012/wordml" xmlns:w16cei="http://schemas.microsoft.com/office/word/2026/wordml/cei" xmlns:w16cex="http://schemas.microsoft.com/office/word/2018/wordml/cex" xmlns:w16cid="http://schemas.microsoft.com/office/word/2016/wordml/cid" xmlns:w16="http://schemas.microsoft.com/office/word/2018/wordml" xmlns:w16du="http://schemas.microsoft.com/office/word/2023/wordml/word16du" xmlns:w16sdtdh="http://schemas.microsoft.com/office/word/2020/wordml/sdtdatahash" xmlns:w16sdtfl="http://schemas.microsoft.com/office/word/2024/wordml/sdtformatlock" xmlns:w16se="http://schemas.microsoft.com/office/word/2015/wordml/symex" xmlns:wpg="http://schemas.microsoft.com/office/word/2010/wordprocessingGroup" xmlns:wpi="http://schemas.microsoft.com/office/word/2010/wordprocessingInk" xmlns:wne="http://schemas.microsoft.com/office/word/2006/wordml" xmlns:wps="http://schemas.microsoft.com/office/word/2010/wordprocessingShape" mc:Ignorable="w14 w15 w16se w16cid w16 w16cex w16sdtdh w16sdtfl w16du wp14">
+<w:hdr xmlns:wpc="http://schemas.microsoft.com/office/word/2010/wordprocessingCanvas" xmlns:cx="http://schemas.microsoft.com/office/drawing/2014/chartex" xmlns:cx1="http://schemas.microsoft.com/office/drawing/2015/9/8/chartex" xmlns:cx2="http://schemas.microsoft.com/office/drawing/2015/10/21/chartex" xmlns:cx3="http://schemas.microsoft.com/office/drawing/2016/5/9/chartex" xmlns:cx4="http://schemas.microsoft.com/office/drawing/2016/5/10/chartex" xmlns:cx5="http://schemas.microsoft.com/office/drawing/2016/5/11/chartex" xmlns:cx6="http://schemas.microsoft.com/office/drawing/2016/5/12/chartex" xmlns:cx7="http://schemas.microsoft.com/office/drawing/2016/5/13/chartex" xmlns:cx8="http://schemas.microsoft.com/office/drawing/2016/5/14/chartex" xmlns:mc="http://schemas.openxmlformats.org/markup-compatibility/2006" xmlns:aink="http://schemas.microsoft.com/office/drawing/2016/ink" xmlns:am3d="http://schemas.microsoft.com/office/drawing/2017/model3d" xmlns:o="urn:schemas-microsoft-com:office:office" xmlns:oel="http://schemas.microsoft.com/office/2019/extlst" xmlns:r="http://schemas.openxmlformats.org/officeDocument/2006/relationships" xmlns:m="http://schemas.openxmlformats.org/officeDocument/2006/math" xmlns:v="urn:schemas-microsoft-com:vml" xmlns:wp14="http://schemas.microsoft.com/office/word/2010/wordprocessingDrawing" xmlns:wp="http://schemas.openxmlformats.org/drawingml/2006/wordprocessingDrawing" xmlns:w10="urn:schemas-microsoft-com:office:word" xmlns:w="http://schemas.openxmlformats.org/wordprocessingml/2006/main" xmlns:w14="http://schemas.microsoft.com/office/word/2010/wordml" xmlns:w15="http://schemas.microsoft.com/office/word/2012/wordml" xmlns:w16cex="http://schemas.microsoft.com/office/word/2018/wordml/cex" xmlns:w16cid="http://schemas.microsoft.com/office/word/2016/wordml/cid" xmlns:w16="http://schemas.microsoft.com/office/word/2018/wordml" xmlns:w16du="http://schemas.microsoft.com/office/word/2023/wordml/word16du" xmlns:w16sdtdh="http://schemas.microsoft.com/office/word/2020/wordml/sdtdatahash" xmlns:w16sdtfl="http://schemas.microsoft.com/office/word/2024/wordml/sdtformatlock" xmlns:w16se="http://schemas.microsoft.com/office/word/2015/wordml/symex" xmlns:wpg="http://schemas.microsoft.com/office/word/2010/wordprocessingGroup" xmlns:wpi="http://schemas.microsoft.com/office/word/2010/wordprocessingInk" xmlns:wne="http://schemas.microsoft.com/office/word/2006/wordml" xmlns:wps="http://schemas.microsoft.com/office/word/2010/wordprocessingShape" mc:Ignorable="w14 w15 w16se w16cid w16 w16cex w16sdtdh w16sdtfl w16du wp14">
   <w:p>
     <w:pPr>
       <w:pStyle w:val="Cabealho"/>
@@ -10076,7 +10016,7 @@
       <w:rPr>
         <w:noProof/>
       </w:rPr>
-      <w:pict w14:anchorId="4A712362">
+      <w:pict w14:anchorId="06E35E39">
         <v:shapetype id="_x0000_t75" coordsize="21600,21600" o:spt="75" o:preferrelative="t" path="m@4@5l@4@11@9@11@9@5xe" filled="f" stroked="f">
           <v:stroke joinstyle="miter"/>
           <v:formulas>
@@ -10096,8 +10036,9 @@
           <v:path o:extrusionok="f" gradientshapeok="t" o:connecttype="rect"/>
           <o:lock v:ext="edit" aspectratio="t"/>
         </v:shapetype>
-        <v:shape id="WordPictureWatermark404685095" o:spid="_x0000_s1036" type="#_x0000_t75" style="position:absolute;margin-left:0;margin-top:0;width:595.35pt;height:842.1pt;z-index:-251656192;mso-position-horizontal:center;mso-position-horizontal-relative:margin;mso-position-vertical:center;mso-position-vertical-relative:margin" o:allowincell="f">
+        <v:shape id="WordPictureWatermark692647189" o:spid="_x0000_s1039" type="#_x0000_t75" style="position:absolute;margin-left:0;margin-top:0;width:595.35pt;height:842.1pt;z-index:-251656192;mso-position-horizontal:center;mso-position-horizontal-relative:margin;mso-position-vertical:center;mso-position-vertical-relative:margin" o:allowincell="f">
           <v:imagedata r:id="rId1" o:title="Marca Dágua - Termo SETCEMG"/>
+          <w10:wrap anchorx="margin" anchory="margin"/>
         </v:shape>
       </w:pict>
     </w:r>
@@ -10106,7 +10047,7 @@
 </file>
 
 <file path=word/header3.xml><?xml version="1.0" encoding="utf-8"?>
-<w:hdr xmlns:wpc="http://schemas.microsoft.com/office/word/2010/wordprocessingCanvas" xmlns:cx="http://schemas.microsoft.com/office/drawing/2014/chartex" xmlns:cx1="http://schemas.microsoft.com/office/drawing/2015/9/8/chartex" xmlns:cx2="http://schemas.microsoft.com/office/drawing/2015/10/21/chartex" xmlns:cx3="http://schemas.microsoft.com/office/drawing/2016/5/9/chartex" xmlns:cx4="http://schemas.microsoft.com/office/drawing/2016/5/10/chartex" xmlns:cx5="http://schemas.microsoft.com/office/drawing/2016/5/11/chartex" xmlns:cx6="http://schemas.microsoft.com/office/drawing/2016/5/12/chartex" xmlns:cx7="http://schemas.microsoft.com/office/drawing/2016/5/13/chartex" xmlns:cx8="http://schemas.microsoft.com/office/drawing/2016/5/14/chartex" xmlns:mc="http://schemas.openxmlformats.org/markup-compatibility/2006" xmlns:aink="http://schemas.microsoft.com/office/drawing/2016/ink" xmlns:am3d="http://schemas.microsoft.com/office/drawing/2017/model3d" xmlns:o="urn:schemas-microsoft-com:office:office" xmlns:oel="http://schemas.microsoft.com/office/2019/extlst" xmlns:r="http://schemas.openxmlformats.org/officeDocument/2006/relationships" xmlns:m="http://schemas.openxmlformats.org/officeDocument/2006/math" xmlns:v="urn:schemas-microsoft-com:vml" xmlns:wp14="http://schemas.microsoft.com/office/word/2010/wordprocessingDrawing" xmlns:wp="http://schemas.openxmlformats.org/drawingml/2006/wordprocessingDrawing" xmlns:w10="urn:schemas-microsoft-com:office:word" xmlns:w="http://schemas.openxmlformats.org/wordprocessingml/2006/main" xmlns:w14="http://schemas.microsoft.com/office/word/2010/wordml" xmlns:w15="http://schemas.microsoft.com/office/word/2012/wordml" xmlns:w16cei="http://schemas.microsoft.com/office/word/2026/wordml/cei" xmlns:w16cex="http://schemas.microsoft.com/office/word/2018/wordml/cex" xmlns:w16cid="http://schemas.microsoft.com/office/word/2016/wordml/cid" xmlns:w16="http://schemas.microsoft.com/office/word/2018/wordml" xmlns:w16du="http://schemas.microsoft.com/office/word/2023/wordml/word16du" xmlns:w16sdtdh="http://schemas.microsoft.com/office/word/2020/wordml/sdtdatahash" xmlns:w16sdtfl="http://schemas.microsoft.com/office/word/2024/wordml/sdtformatlock" xmlns:w16se="http://schemas.microsoft.com/office/word/2015/wordml/symex" xmlns:wpg="http://schemas.microsoft.com/office/word/2010/wordprocessingGroup" xmlns:wpi="http://schemas.microsoft.com/office/word/2010/wordprocessingInk" xmlns:wne="http://schemas.microsoft.com/office/word/2006/wordml" xmlns:wps="http://schemas.microsoft.com/office/word/2010/wordprocessingShape" mc:Ignorable="w14 w15 w16se w16cid w16 w16cex w16sdtdh w16sdtfl w16du wp14">
+<w:hdr xmlns:wpc="http://schemas.microsoft.com/office/word/2010/wordprocessingCanvas" xmlns:cx="http://schemas.microsoft.com/office/drawing/2014/chartex" xmlns:cx1="http://schemas.microsoft.com/office/drawing/2015/9/8/chartex" xmlns:cx2="http://schemas.microsoft.com/office/drawing/2015/10/21/chartex" xmlns:cx3="http://schemas.microsoft.com/office/drawing/2016/5/9/chartex" xmlns:cx4="http://schemas.microsoft.com/office/drawing/2016/5/10/chartex" xmlns:cx5="http://schemas.microsoft.com/office/drawing/2016/5/11/chartex" xmlns:cx6="http://schemas.microsoft.com/office/drawing/2016/5/12/chartex" xmlns:cx7="http://schemas.microsoft.com/office/drawing/2016/5/13/chartex" xmlns:cx8="http://schemas.microsoft.com/office/drawing/2016/5/14/chartex" xmlns:mc="http://schemas.openxmlformats.org/markup-compatibility/2006" xmlns:aink="http://schemas.microsoft.com/office/drawing/2016/ink" xmlns:am3d="http://schemas.microsoft.com/office/drawing/2017/model3d" xmlns:o="urn:schemas-microsoft-com:office:office" xmlns:oel="http://schemas.microsoft.com/office/2019/extlst" xmlns:r="http://schemas.openxmlformats.org/officeDocument/2006/relationships" xmlns:m="http://schemas.openxmlformats.org/officeDocument/2006/math" xmlns:v="urn:schemas-microsoft-com:vml" xmlns:wp14="http://schemas.microsoft.com/office/word/2010/wordprocessingDrawing" xmlns:wp="http://schemas.openxmlformats.org/drawingml/2006/wordprocessingDrawing" xmlns:w10="urn:schemas-microsoft-com:office:word" xmlns:w="http://schemas.openxmlformats.org/wordprocessingml/2006/main" xmlns:w14="http://schemas.microsoft.com/office/word/2010/wordml" xmlns:w15="http://schemas.microsoft.com/office/word/2012/wordml" xmlns:w16cex="http://schemas.microsoft.com/office/word/2018/wordml/cex" xmlns:w16cid="http://schemas.microsoft.com/office/word/2016/wordml/cid" xmlns:w16="http://schemas.microsoft.com/office/word/2018/wordml" xmlns:w16du="http://schemas.microsoft.com/office/word/2023/wordml/word16du" xmlns:w16sdtdh="http://schemas.microsoft.com/office/word/2020/wordml/sdtdatahash" xmlns:w16sdtfl="http://schemas.microsoft.com/office/word/2024/wordml/sdtformatlock" xmlns:w16se="http://schemas.microsoft.com/office/word/2015/wordml/symex" xmlns:wpg="http://schemas.microsoft.com/office/word/2010/wordprocessingGroup" xmlns:wpi="http://schemas.microsoft.com/office/word/2010/wordprocessingInk" xmlns:wne="http://schemas.microsoft.com/office/word/2006/wordml" xmlns:wps="http://schemas.microsoft.com/office/word/2010/wordprocessingShape" mc:Ignorable="w14 w15 w16se w16cid w16 w16cex w16sdtdh w16sdtfl w16du wp14">
   <w:p>
     <w:pPr>
       <w:pStyle w:val="Cabealho"/>
@@ -10115,7 +10056,7 @@
       <w:rPr>
         <w:noProof/>
       </w:rPr>
-      <w:pict w14:anchorId="187B19F9">
+      <w:pict w14:anchorId="0B9E90FD">
         <v:shapetype id="_x0000_t75" coordsize="21600,21600" o:spt="75" o:preferrelative="t" path="m@4@5l@4@11@9@11@9@5xe" filled="f" stroked="f">
           <v:stroke joinstyle="miter"/>
           <v:formulas>
@@ -10135,8 +10076,9 @@
           <v:path o:extrusionok="f" gradientshapeok="t" o:connecttype="rect"/>
           <o:lock v:ext="edit" aspectratio="t"/>
         </v:shapetype>
-        <v:shape id="WordPictureWatermark404685093" o:spid="_x0000_s1034" type="#_x0000_t75" style="position:absolute;margin-left:0;margin-top:0;width:595.35pt;height:842.1pt;z-index:-251658240;mso-position-horizontal:center;mso-position-horizontal-relative:margin;mso-position-vertical:center;mso-position-vertical-relative:margin" o:allowincell="f">
+        <v:shape id="WordPictureWatermark692647187" o:spid="_x0000_s1037" type="#_x0000_t75" style="position:absolute;margin-left:0;margin-top:0;width:595.35pt;height:842.1pt;z-index:-251658240;mso-position-horizontal:center;mso-position-horizontal-relative:margin;mso-position-vertical:center;mso-position-vertical-relative:margin" o:allowincell="f">
           <v:imagedata r:id="rId1" o:title="Marca Dágua - Termo SETCEMG"/>
+          <w10:wrap anchorx="margin" anchory="margin"/>
         </v:shape>
       </w:pict>
     </w:r>
@@ -10145,7 +10087,7 @@
 </file>
 
 <file path=word/numbering.xml><?xml version="1.0" encoding="utf-8"?>
-<w:numbering xmlns:wpc="http://schemas.microsoft.com/office/word/2010/wordprocessingCanvas" xmlns:cx="http://schemas.microsoft.com/office/drawing/2014/chartex" xmlns:cx1="http://schemas.microsoft.com/office/drawing/2015/9/8/chartex" xmlns:cx2="http://schemas.microsoft.com/office/drawing/2015/10/21/chartex" xmlns:cx3="http://schemas.microsoft.com/office/drawing/2016/5/9/chartex" xmlns:cx4="http://schemas.microsoft.com/office/drawing/2016/5/10/chartex" xmlns:cx5="http://schemas.microsoft.com/office/drawing/2016/5/11/chartex" xmlns:cx6="http://schemas.microsoft.com/office/drawing/2016/5/12/chartex" xmlns:cx7="http://schemas.microsoft.com/office/drawing/2016/5/13/chartex" xmlns:cx8="http://schemas.microsoft.com/office/drawing/2016/5/14/chartex" xmlns:mc="http://schemas.openxmlformats.org/markup-compatibility/2006" xmlns:aink="http://schemas.microsoft.com/office/drawing/2016/ink" xmlns:am3d="http://schemas.microsoft.com/office/drawing/2017/model3d" xmlns:o="urn:schemas-microsoft-com:office:office" xmlns:oel="http://schemas.microsoft.com/office/2019/extlst" xmlns:r="http://schemas.openxmlformats.org/officeDocument/2006/relationships" xmlns:m="http://schemas.openxmlformats.org/officeDocument/2006/math" xmlns:v="urn:schemas-microsoft-com:vml" xmlns:wp14="http://schemas.microsoft.com/office/word/2010/wordprocessingDrawing" xmlns:wp="http://schemas.openxmlformats.org/drawingml/2006/wordprocessingDrawing" xmlns:w10="urn:schemas-microsoft-com:office:word" xmlns:w="http://schemas.openxmlformats.org/wordprocessingml/2006/main" xmlns:w14="http://schemas.microsoft.com/office/word/2010/wordml" xmlns:w15="http://schemas.microsoft.com/office/word/2012/wordml" xmlns:w16cei="http://schemas.microsoft.com/office/word/2026/wordml/cei" xmlns:w16cex="http://schemas.microsoft.com/office/word/2018/wordml/cex" xmlns:w16cid="http://schemas.microsoft.com/office/word/2016/wordml/cid" xmlns:w16="http://schemas.microsoft.com/office/word/2018/wordml" xmlns:w16du="http://schemas.microsoft.com/office/word/2023/wordml/word16du" xmlns:w16sdtdh="http://schemas.microsoft.com/office/word/2020/wordml/sdtdatahash" xmlns:w16sdtfl="http://schemas.microsoft.com/office/word/2024/wordml/sdtformatlock" xmlns:w16se="http://schemas.microsoft.com/office/word/2015/wordml/symex" xmlns:wpg="http://schemas.microsoft.com/office/word/2010/wordprocessingGroup" xmlns:wpi="http://schemas.microsoft.com/office/word/2010/wordprocessingInk" xmlns:wne="http://schemas.microsoft.com/office/word/2006/wordml" xmlns:wps="http://schemas.microsoft.com/office/word/2010/wordprocessingShape" mc:Ignorable="w14 w15 w16se w16cid w16 w16cex w16sdtdh w16sdtfl w16du wp14">
+<w:numbering xmlns:wpc="http://schemas.microsoft.com/office/word/2010/wordprocessingCanvas" xmlns:cx="http://schemas.microsoft.com/office/drawing/2014/chartex" xmlns:cx1="http://schemas.microsoft.com/office/drawing/2015/9/8/chartex" xmlns:cx2="http://schemas.microsoft.com/office/drawing/2015/10/21/chartex" xmlns:cx3="http://schemas.microsoft.com/office/drawing/2016/5/9/chartex" xmlns:cx4="http://schemas.microsoft.com/office/drawing/2016/5/10/chartex" xmlns:cx5="http://schemas.microsoft.com/office/drawing/2016/5/11/chartex" xmlns:cx6="http://schemas.microsoft.com/office/drawing/2016/5/12/chartex" xmlns:cx7="http://schemas.microsoft.com/office/drawing/2016/5/13/chartex" xmlns:cx8="http://schemas.microsoft.com/office/drawing/2016/5/14/chartex" xmlns:mc="http://schemas.openxmlformats.org/markup-compatibility/2006" xmlns:aink="http://schemas.microsoft.com/office/drawing/2016/ink" xmlns:am3d="http://schemas.microsoft.com/office/drawing/2017/model3d" xmlns:o="urn:schemas-microsoft-com:office:office" xmlns:oel="http://schemas.microsoft.com/office/2019/extlst" xmlns:r="http://schemas.openxmlformats.org/officeDocument/2006/relationships" xmlns:m="http://schemas.openxmlformats.org/officeDocument/2006/math" xmlns:v="urn:schemas-microsoft-com:vml" xmlns:wp14="http://schemas.microsoft.com/office/word/2010/wordprocessingDrawing" xmlns:wp="http://schemas.openxmlformats.org/drawingml/2006/wordprocessingDrawing" xmlns:w10="urn:schemas-microsoft-com:office:word" xmlns:w="http://schemas.openxmlformats.org/wordprocessingml/2006/main" xmlns:w14="http://schemas.microsoft.com/office/word/2010/wordml" xmlns:w15="http://schemas.microsoft.com/office/word/2012/wordml" xmlns:w16cex="http://schemas.microsoft.com/office/word/2018/wordml/cex" xmlns:w16cid="http://schemas.microsoft.com/office/word/2016/wordml/cid" xmlns:w16="http://schemas.microsoft.com/office/word/2018/wordml" xmlns:w16du="http://schemas.microsoft.com/office/word/2023/wordml/word16du" xmlns:w16sdtdh="http://schemas.microsoft.com/office/word/2020/wordml/sdtdatahash" xmlns:w16sdtfl="http://schemas.microsoft.com/office/word/2024/wordml/sdtformatlock" xmlns:w16se="http://schemas.microsoft.com/office/word/2015/wordml/symex" xmlns:wpg="http://schemas.microsoft.com/office/word/2010/wordprocessingGroup" xmlns:wpi="http://schemas.microsoft.com/office/word/2010/wordprocessingInk" xmlns:wne="http://schemas.microsoft.com/office/word/2006/wordml" xmlns:wps="http://schemas.microsoft.com/office/word/2010/wordprocessingShape" mc:Ignorable="w14 w15 w16se w16cid w16 w16cex w16sdtdh w16sdtfl w16du wp14">
   <w:abstractNum w:abstractNumId="0" w15:restartNumberingAfterBreak="0">
     <w:nsid w:val="263E54C9"/>
     <w:multiLevelType w:val="multilevel"/>
@@ -11484,7 +11426,6 @@
   <w:style w:type="character" w:default="1" w:styleId="Fontepargpadro">
     <w:name w:val="Default Paragraph Font"/>
     <w:uiPriority w:val="1"/>
-    <w:semiHidden/>
     <w:unhideWhenUsed/>
   </w:style>
   <w:style w:type="table" w:default="1" w:styleId="Tabelanormal">

</xml_diff>